<commit_message>
feat: update Isoloader MJ35 testing plan with new travel speeds, rest rule cycles, and battery temp limits
</commit_message>
<xml_diff>
--- a/docs/Spec/Isoloader_MJ35_Testing_Plan_and_Inspection_Elements.docx
+++ b/docs/Spec/Isoloader_MJ35_Testing_Plan_and_Inspection_Elements.docx
@@ -772,7 +772,7 @@
                 <w:rFonts w:ascii="Calibri" w:hAnsi="Calibri"/>
                 <w:sz w:val="19"/>
               </w:rPr>
-              <w:t>10.0 km/h (Unladen) / 6.0 km/h (Laden)</w:t>
+              <w:t>8.0 km/h (Unladen) / 5.0 km/h (Laden)</w:t>
             </w:r>
           </w:p>
         </w:tc>
@@ -789,7 +789,7 @@
                 <w:rFonts w:ascii="Calibri" w:hAnsi="Calibri"/>
                 <w:sz w:val="19"/>
               </w:rPr>
-              <w:t>Laden travel speed must be 6.0 km/h ± 5%</w:t>
+              <w:t>Laden travel speed must be 5.0 km/h ± 5%</w:t>
             </w:r>
           </w:p>
         </w:tc>
@@ -1491,7 +1491,7 @@
           <w:rFonts w:ascii="Calibri" w:hAnsi="Calibri"/>
           <w:sz w:val="22"/>
         </w:rPr>
-        <w:t>If the winch system operates continuously for 18 complete cycles under full load, the machine must be paused for a minimum of 10 minutes.</w:t>
+        <w:t>If the winch system operates continuously for 20 complete cycles under full load, the machine must be paused for a minimum of 10 minutes.</w:t>
       </w:r>
     </w:p>
     <w:p>
@@ -1563,14 +1563,14 @@
           <w:b/>
           <w:sz w:val="22"/>
         </w:rPr>
-        <w:t xml:space="preserve">1. Optimal Temperature Range: </w:t>
+        <w:t xml:space="preserve">1. Max Temperature Limit: </w:t>
       </w:r>
       <w:r>
         <w:rPr>
           <w:rFonts w:ascii="Calibri" w:hAnsi="Calibri"/>
           <w:sz w:val="22"/>
         </w:rPr>
-        <w:t>1. Throughout the 20-cycle winch performance test, the average battery pack temperature (BMSA_PackAverageTemperature and BMSB_PackAverageTemperature) must remain stable within the optimal range of 27.0°C to 29.0°C.</w:t>
+        <w:t>1. Throughout the 20-cycle winch performance test, the average battery pack temperature (BMSA_PackAverageTemperature and BMSB_PackAverageTemperature) must remain stable and below 32.0°C.</w:t>
       </w:r>
     </w:p>
     <w:p>

</xml_diff>